<commit_message>
New tagline and headline, document footer with builtbycolton.com / forumplaybook.com, Ikigai worksheet
Template Contract v1.3: footer tagline 'The operating system and tools to make Forum easy and awesome.'
and builtbycolton.com / forumplaybook.com lower right, Deep Dust for contrast. One-pagers, 5% sheet,
Word template and brand guide updated; homepage hero, meta, og-image and /facilitate/ masthead move
to the new tagline. New Ikigai Worksheet 11x17 (worksheets/_build/ikigai).

Co-Authored-By: Claude Opus 5.5 <noreply@anthropic.com>
</commit_message>
<xml_diff>
--- a/templates/forum-playbook-document-template-v1.1.docx
+++ b/templates/forum-playbook-document-template-v1.1.docx
@@ -1225,36 +1225,33 @@
     <w:r>
       <w:rPr>
         <w:rFonts w:ascii="Consolas" w:cs="Consolas" w:eastAsia="Consolas" w:hAnsi="Consolas"/>
-        <w:color w:val="c4b8a8"/>
+        <w:color w:val="4a4038"/>
         <w:sz w:val="12"/>
         <w:szCs w:val="12"/>
         <w:rtl w:val="0"/>
       </w:rPr>
-      <w:t xml:space="preserve">A Resource Hub for Forums, Moderators, &amp; Facilitators</w:t>
+      <w:t xml:space="preserve">The operating system and tools to make Forum easy and awesome</w:t>
     </w:r>
     <w:r>
       <w:rPr>
         <w:rFonts w:ascii="Consolas" w:cs="Consolas" w:eastAsia="Consolas" w:hAnsi="Consolas"/>
-        <w:color w:val="c4b8a8"/>
+        <w:color w:val="4a4038"/>
         <w:sz w:val="13"/>
         <w:szCs w:val="13"/>
         <w:rtl w:val="0"/>
       </w:rPr>
       <w:t xml:space="preserve">. </w:t>
       <w:tab/>
-      <w:t xml:space="preserve">     </w:t>
-      <w:tab/>
-      <w:t xml:space="preserve">    </w:t>
     </w:r>
     <w:r>
       <w:rPr>
         <w:rFonts w:ascii="Consolas" w:cs="Consolas" w:eastAsia="Consolas" w:hAnsi="Consolas"/>
-        <w:color w:val="c4b8a8"/>
-        <w:sz w:val="11"/>
-        <w:szCs w:val="11"/>
+        <w:color w:val="4a4038"/>
+        <w:sz w:val="13"/>
+        <w:szCs w:val="13"/>
         <w:rtl w:val="0"/>
       </w:rPr>
-      <w:t xml:space="preserve">ForumPlaybook.com</w:t>
+      <w:t xml:space="preserve">builtbycolton.com / forumplaybook.com</w:t>
     </w:r>
     <w:r>
       <w:rPr>

</xml_diff>